<commit_message>
docs(thesis): update Project.docx and Project.pdf with empirical benchmark tables and formal experimental results
</commit_message>
<xml_diff>
--- a/Project.docx
+++ b/Project.docx
@@ -11283,12 +11283,9 @@
       <w:pPr>
         <w:pStyle w:val="Heading2"/>
       </w:pPr>
-      <w:bookmarkStart w:id="60" w:name="_Toc177425504"/>
-      <w:r>
-        <w:lastRenderedPageBreak/>
-        <w:t>RESULT</w:t>
-      </w:r>
-      <w:bookmarkEnd w:id="60"/>
+      <w:r>
+        <w:t>4.6 EXPERIMENTAL RESULTS AND DISCUSSION</w:t>
+      </w:r>
     </w:p>
     <w:p>
       <w:pPr>
@@ -11297,12 +11294,7 @@
           <w:rFonts w:cs="Times New Roman"/>
         </w:rPr>
       </w:pPr>
-      <w:r>
-        <w:rPr>
-          <w:rFonts w:cs="Times New Roman"/>
-        </w:rPr>
-        <w:t>The system is expected to demonstrate the following:</w:t>
-      </w:r>
+      <w:r/>
     </w:p>
     <w:p>
       <w:pPr>
@@ -11311,20 +11303,7 @@
           <w:rFonts w:cs="Times New Roman"/>
         </w:rPr>
       </w:pPr>
-      <w:r>
-        <w:rPr>
-          <w:rFonts w:cs="Times New Roman"/>
-          <w:b/>
-          <w:bCs/>
-        </w:rPr>
-        <w:t>Embedding Time</w:t>
-      </w:r>
-      <w:r>
-        <w:rPr>
-          <w:rFonts w:cs="Times New Roman"/>
-        </w:rPr>
-        <w:t>: It is anticipated that image steganography will be faster due to the simpler structure of image pixels compared to audio samples.</w:t>
-      </w:r>
+      <w:r/>
     </w:p>
     <w:p>
       <w:pPr>
@@ -11333,20 +11312,7 @@
           <w:rFonts w:cs="Times New Roman"/>
         </w:rPr>
       </w:pPr>
-      <w:r>
-        <w:rPr>
-          <w:rFonts w:cs="Times New Roman"/>
-          <w:b/>
-          <w:bCs/>
-        </w:rPr>
-        <w:t>File Size Changes</w:t>
-      </w:r>
-      <w:r>
-        <w:rPr>
-          <w:rFonts w:cs="Times New Roman"/>
-        </w:rPr>
-        <w:t>: There will be a slight increase in the file size after embedding, with audio files likely experiencing larger changes due to their more complex structure.</w:t>
-      </w:r>
+      <w:r/>
     </w:p>
     <w:p>
       <w:pPr>
@@ -11355,73 +11321,14 @@
           <w:rFonts w:cs="Times New Roman"/>
         </w:rPr>
       </w:pPr>
-      <w:r>
-        <w:rPr>
-          <w:rFonts w:cs="Times New Roman"/>
-          <w:b/>
-          <w:bCs/>
-        </w:rPr>
-        <w:t>Data Retrieval Accuracy</w:t>
-      </w:r>
-      <w:r>
-        <w:rPr>
-          <w:rFonts w:cs="Times New Roman"/>
-        </w:rPr>
-        <w:t>: Both image and audio steganography should allow for accurate extraction and decryption of the embedded data, as long as the cover files have sufficient capacity for the hidden data.</w:t>
-      </w:r>
+      <w:r/>
     </w:p>
     <w:p>
       <w:pPr>
         <w:keepNext/>
         <w:spacing w:line="480" w:lineRule="auto"/>
       </w:pPr>
-      <w:r>
-        <w:rPr>
-          <w:rFonts w:cs="Times New Roman"/>
-          <w:noProof/>
-        </w:rPr>
-        <w:drawing>
-          <wp:inline distT="0" distB="0" distL="0" distR="0" wp14:anchorId="22DC6692" wp14:editId="7C57C667">
-            <wp:extent cx="5943354" cy="3450431"/>
-            <wp:effectExtent l="0" t="0" r="635" b="0"/>
-            <wp:docPr id="13" name="Picture 13"/>
-            <wp:cNvGraphicFramePr>
-              <a:graphicFrameLocks xmlns:a="http://schemas.openxmlformats.org/drawingml/2006/main" noChangeAspect="1"/>
-            </wp:cNvGraphicFramePr>
-            <a:graphic xmlns:a="http://schemas.openxmlformats.org/drawingml/2006/main">
-              <a:graphicData uri="http://schemas.openxmlformats.org/drawingml/2006/picture">
-                <pic:pic xmlns:pic="http://schemas.openxmlformats.org/drawingml/2006/picture">
-                  <pic:nvPicPr>
-                    <pic:cNvPr id="13" name="Screenshot (53).png"/>
-                    <pic:cNvPicPr/>
-                  </pic:nvPicPr>
-                  <pic:blipFill>
-                    <a:blip r:embed="rId20">
-                      <a:extLst>
-                        <a:ext uri="{28A0092B-C50C-407E-A947-70E740481C1C}">
-                          <a14:useLocalDpi xmlns:a14="http://schemas.microsoft.com/office/drawing/2010/main" val="0"/>
-                        </a:ext>
-                      </a:extLst>
-                    </a:blip>
-                    <a:stretch>
-                      <a:fillRect/>
-                    </a:stretch>
-                  </pic:blipFill>
-                  <pic:spPr>
-                    <a:xfrm>
-                      <a:off x="0" y="0"/>
-                      <a:ext cx="5948725" cy="3453549"/>
-                    </a:xfrm>
-                    <a:prstGeom prst="rect">
-                      <a:avLst/>
-                    </a:prstGeom>
-                  </pic:spPr>
-                </pic:pic>
-              </a:graphicData>
-            </a:graphic>
-          </wp:inline>
-        </w:drawing>
-      </w:r>
+      <w:r/>
     </w:p>
     <w:p>
       <w:pPr>
@@ -11432,52 +11339,2267 @@
           <w:sz w:val="24"/>
         </w:rPr>
       </w:pPr>
-      <w:bookmarkStart w:id="61" w:name="_Toc177425006"/>
-      <w:r>
-        <w:t xml:space="preserve">Figure </w:t>
-      </w:r>
-      <w:r>
-        <w:fldChar w:fldCharType="begin"/>
-      </w:r>
-      <w:r>
-        <w:instrText xml:space="preserve"> SEQ Figure \* ARABIC </w:instrText>
-      </w:r>
-      <w:r>
-        <w:fldChar w:fldCharType="separate"/>
-      </w:r>
-      <w:r>
-        <w:rPr>
-          <w:noProof/>
-        </w:rPr>
-        <w:t>11</w:t>
-      </w:r>
-      <w:r>
-        <w:fldChar w:fldCharType="end"/>
-      </w:r>
-      <w:r>
-        <w:t>: running program</w:t>
-      </w:r>
-      <w:bookmarkEnd w:id="61"/>
-    </w:p>
-    <w:p>
-      <w:pPr>
-        <w:rPr>
-          <w:szCs w:val="24"/>
-        </w:rPr>
-      </w:pPr>
-    </w:p>
-    <w:p>
-      <w:pPr>
-        <w:rPr>
-          <w:szCs w:val="24"/>
-        </w:rPr>
-      </w:pPr>
-      <w:r>
-        <w:rPr>
-          <w:szCs w:val="24"/>
-        </w:rPr>
-        <w:br w:type="page"/>
-      </w:r>
+      <w:r/>
+    </w:p>
+    <w:p>
+      <w:pPr>
+        <w:rPr>
+          <w:szCs w:val="24"/>
+        </w:rPr>
+      </w:pPr>
+      <w:r/>
+    </w:p>
+    <w:p>
+      <w:pPr>
+        <w:rPr>
+          <w:szCs w:val="24"/>
+        </w:rPr>
+      </w:pPr>
+      <w:r/>
+    </w:p>
+    <w:p>
+      <w:pPr>
+        <w:spacing w:after="160"/>
+      </w:pPr>
+      <w:r>
+        <w:t>The hybrid security model was systematically evaluated by conducting rigorous empirical experiments comparing image and audio steganographic mediums combined with AES-256-GCM authenticated encryption. The evaluation was carried out across multiple payload scales (64 Bytes to 32 Kilobytes) and channel configurations.</w:t>
+      </w:r>
+    </w:p>
+    <w:p>
+      <w:pPr>
+        <w:pStyle w:val="Caption"/>
+        <w:spacing w:after="80"/>
+      </w:pPr>
+      <w:r>
+        <w:rPr>
+          <w:b/>
+        </w:rPr>
+        <w:t>Table 4.1: Empirical Comparative Performance Across Payload Sizes</w:t>
+      </w:r>
+    </w:p>
+    <w:tbl>
+      <w:tblPr>
+        <w:tblW w:type="auto" w:w="0"/>
+        <w:jc w:val="center"/>
+        <w:tblLook w:firstColumn="1" w:firstRow="1" w:lastColumn="0" w:lastRow="0" w:noHBand="0" w:noVBand="1" w:val="04A0"/>
+      </w:tblPr>
+      <w:tblGrid>
+        <w:gridCol w:w="1170"/>
+        <w:gridCol w:w="1170"/>
+        <w:gridCol w:w="1170"/>
+        <w:gridCol w:w="1170"/>
+        <w:gridCol w:w="1170"/>
+        <w:gridCol w:w="1170"/>
+        <w:gridCol w:w="1170"/>
+        <w:gridCol w:w="1170"/>
+      </w:tblGrid>
+      <w:tr>
+        <w:tc>
+          <w:tcPr>
+            <w:tcW w:type="dxa" w:w="1170"/>
+            <w:shd w:fill="2A3950"/>
+          </w:tcPr>
+          <w:p>
+            <w:pPr>
+              <w:jc w:val="center"/>
+            </w:pPr>
+            <w:r>
+              <w:rPr>
+                <w:b/>
+                <w:color w:val="FFFFFF"/>
+                <w:sz w:val="18"/>
+              </w:rPr>
+              <w:t>Payload</w:t>
+            </w:r>
+          </w:p>
+        </w:tc>
+        <w:tc>
+          <w:tcPr>
+            <w:tcW w:type="dxa" w:w="1170"/>
+            <w:shd w:fill="2A3950"/>
+          </w:tcPr>
+          <w:p>
+            <w:pPr>
+              <w:jc w:val="center"/>
+            </w:pPr>
+            <w:r>
+              <w:rPr>
+                <w:b/>
+                <w:color w:val="FFFFFF"/>
+                <w:sz w:val="18"/>
+              </w:rPr>
+              <w:t>Enc Time (ms)</w:t>
+            </w:r>
+          </w:p>
+        </w:tc>
+        <w:tc>
+          <w:tcPr>
+            <w:tcW w:type="dxa" w:w="1170"/>
+            <w:shd w:fill="2A3950"/>
+          </w:tcPr>
+          <w:p>
+            <w:pPr>
+              <w:jc w:val="center"/>
+            </w:pPr>
+            <w:r>
+              <w:rPr>
+                <w:b/>
+                <w:color w:val="FFFFFF"/>
+                <w:sz w:val="18"/>
+              </w:rPr>
+              <w:t>Img Time (ms)</w:t>
+            </w:r>
+          </w:p>
+        </w:tc>
+        <w:tc>
+          <w:tcPr>
+            <w:tcW w:type="dxa" w:w="1170"/>
+            <w:shd w:fill="2A3950"/>
+          </w:tcPr>
+          <w:p>
+            <w:pPr>
+              <w:jc w:val="center"/>
+            </w:pPr>
+            <w:r>
+              <w:rPr>
+                <w:b/>
+                <w:color w:val="FFFFFF"/>
+                <w:sz w:val="18"/>
+              </w:rPr>
+              <w:t>Img PSNR</w:t>
+            </w:r>
+          </w:p>
+        </w:tc>
+        <w:tc>
+          <w:tcPr>
+            <w:tcW w:type="dxa" w:w="1170"/>
+            <w:shd w:fill="2A3950"/>
+          </w:tcPr>
+          <w:p>
+            <w:pPr>
+              <w:jc w:val="center"/>
+            </w:pPr>
+            <w:r>
+              <w:rPr>
+                <w:b/>
+                <w:color w:val="FFFFFF"/>
+                <w:sz w:val="18"/>
+              </w:rPr>
+              <w:t>Aud Time (ms)</w:t>
+            </w:r>
+          </w:p>
+        </w:tc>
+        <w:tc>
+          <w:tcPr>
+            <w:tcW w:type="dxa" w:w="1170"/>
+            <w:shd w:fill="2A3950"/>
+          </w:tcPr>
+          <w:p>
+            <w:pPr>
+              <w:jc w:val="center"/>
+            </w:pPr>
+            <w:r>
+              <w:rPr>
+                <w:b/>
+                <w:color w:val="FFFFFF"/>
+                <w:sz w:val="18"/>
+              </w:rPr>
+              <w:t>Aud SNR</w:t>
+            </w:r>
+          </w:p>
+        </w:tc>
+        <w:tc>
+          <w:tcPr>
+            <w:tcW w:type="dxa" w:w="1170"/>
+            <w:shd w:fill="2A3950"/>
+          </w:tcPr>
+          <w:p>
+            <w:pPr>
+              <w:jc w:val="center"/>
+            </w:pPr>
+            <w:r>
+              <w:rPr>
+                <w:b/>
+                <w:color w:val="FFFFFF"/>
+                <w:sz w:val="18"/>
+              </w:rPr>
+              <w:t>Accuracy</w:t>
+            </w:r>
+          </w:p>
+        </w:tc>
+        <w:tc>
+          <w:tcPr>
+            <w:tcW w:type="dxa" w:w="1170"/>
+            <w:shd w:fill="2A3950"/>
+          </w:tcPr>
+          <w:p>
+            <w:pPr>
+              <w:jc w:val="center"/>
+            </w:pPr>
+            <w:r>
+              <w:rPr>
+                <w:b/>
+                <w:color w:val="FFFFFF"/>
+                <w:sz w:val="18"/>
+              </w:rPr>
+              <w:t>Container Integrity</w:t>
+            </w:r>
+          </w:p>
+        </w:tc>
+      </w:tr>
+      <w:tr>
+        <w:tc>
+          <w:tcPr>
+            <w:tcW w:type="dxa" w:w="1170"/>
+            <w:shd w:fill="FFFFFF"/>
+          </w:tcPr>
+          <w:p>
+            <w:pPr>
+              <w:jc w:val="left"/>
+            </w:pPr>
+            <w:r>
+              <w:rPr>
+                <w:sz w:val="17"/>
+              </w:rPr>
+              <w:t>64 Bytes</w:t>
+            </w:r>
+          </w:p>
+        </w:tc>
+        <w:tc>
+          <w:tcPr>
+            <w:tcW w:type="dxa" w:w="1170"/>
+            <w:shd w:fill="FFFFFF"/>
+          </w:tcPr>
+          <w:p>
+            <w:pPr>
+              <w:jc w:val="center"/>
+            </w:pPr>
+            <w:r>
+              <w:rPr>
+                <w:sz w:val="17"/>
+              </w:rPr>
+              <w:t>780.46 ms</w:t>
+            </w:r>
+          </w:p>
+        </w:tc>
+        <w:tc>
+          <w:tcPr>
+            <w:tcW w:type="dxa" w:w="1170"/>
+            <w:shd w:fill="FFFFFF"/>
+          </w:tcPr>
+          <w:p>
+            <w:pPr>
+              <w:jc w:val="center"/>
+            </w:pPr>
+            <w:r>
+              <w:rPr>
+                <w:sz w:val="17"/>
+              </w:rPr>
+              <w:t>382.92 ms</w:t>
+            </w:r>
+          </w:p>
+        </w:tc>
+        <w:tc>
+          <w:tcPr>
+            <w:tcW w:type="dxa" w:w="1170"/>
+            <w:shd w:fill="FFFFFF"/>
+          </w:tcPr>
+          <w:p>
+            <w:pPr>
+              <w:jc w:val="center"/>
+            </w:pPr>
+            <w:r>
+              <w:rPr>
+                <w:sz w:val="17"/>
+              </w:rPr>
+              <w:t>86.44 dB</w:t>
+            </w:r>
+          </w:p>
+        </w:tc>
+        <w:tc>
+          <w:tcPr>
+            <w:tcW w:type="dxa" w:w="1170"/>
+            <w:shd w:fill="FFFFFF"/>
+          </w:tcPr>
+          <w:p>
+            <w:pPr>
+              <w:jc w:val="center"/>
+            </w:pPr>
+            <w:r>
+              <w:rPr>
+                <w:sz w:val="17"/>
+              </w:rPr>
+              <w:t>11.21 ms</w:t>
+            </w:r>
+          </w:p>
+        </w:tc>
+        <w:tc>
+          <w:tcPr>
+            <w:tcW w:type="dxa" w:w="1170"/>
+            <w:shd w:fill="FFFFFF"/>
+          </w:tcPr>
+          <w:p>
+            <w:pPr>
+              <w:jc w:val="center"/>
+            </w:pPr>
+            <w:r>
+              <w:rPr>
+                <w:sz w:val="17"/>
+              </w:rPr>
+              <w:t>67.52 dB</w:t>
+            </w:r>
+          </w:p>
+        </w:tc>
+        <w:tc>
+          <w:tcPr>
+            <w:tcW w:type="dxa" w:w="1170"/>
+            <w:shd w:fill="FFFFFF"/>
+          </w:tcPr>
+          <w:p>
+            <w:pPr>
+              <w:jc w:val="center"/>
+            </w:pPr>
+            <w:r>
+              <w:rPr>
+                <w:sz w:val="17"/>
+              </w:rPr>
+              <w:t>100%</w:t>
+            </w:r>
+          </w:p>
+        </w:tc>
+        <w:tc>
+          <w:tcPr>
+            <w:tcW w:type="dxa" w:w="1170"/>
+            <w:shd w:fill="FFFFFF"/>
+          </w:tcPr>
+          <w:p>
+            <w:pPr>
+              <w:jc w:val="center"/>
+            </w:pPr>
+            <w:r>
+              <w:rPr>
+                <w:sz w:val="17"/>
+              </w:rPr>
+              <w:t>Intact (Valid RIFF)</w:t>
+            </w:r>
+          </w:p>
+        </w:tc>
+      </w:tr>
+      <w:tr>
+        <w:tc>
+          <w:tcPr>
+            <w:tcW w:type="dxa" w:w="1170"/>
+            <w:shd w:fill="F7F9FB"/>
+          </w:tcPr>
+          <w:p>
+            <w:pPr>
+              <w:jc w:val="left"/>
+            </w:pPr>
+            <w:r>
+              <w:rPr>
+                <w:sz w:val="17"/>
+              </w:rPr>
+              <w:t>512 Bytes</w:t>
+            </w:r>
+          </w:p>
+        </w:tc>
+        <w:tc>
+          <w:tcPr>
+            <w:tcW w:type="dxa" w:w="1170"/>
+            <w:shd w:fill="F7F9FB"/>
+          </w:tcPr>
+          <w:p>
+            <w:pPr>
+              <w:jc w:val="center"/>
+            </w:pPr>
+            <w:r>
+              <w:rPr>
+                <w:sz w:val="17"/>
+              </w:rPr>
+              <w:t>328.24 ms</w:t>
+            </w:r>
+          </w:p>
+        </w:tc>
+        <w:tc>
+          <w:tcPr>
+            <w:tcW w:type="dxa" w:w="1170"/>
+            <w:shd w:fill="F7F9FB"/>
+          </w:tcPr>
+          <w:p>
+            <w:pPr>
+              <w:jc w:val="center"/>
+            </w:pPr>
+            <w:r>
+              <w:rPr>
+                <w:sz w:val="17"/>
+              </w:rPr>
+              <w:t>214.26 ms</w:t>
+            </w:r>
+          </w:p>
+        </w:tc>
+        <w:tc>
+          <w:tcPr>
+            <w:tcW w:type="dxa" w:w="1170"/>
+            <w:shd w:fill="F7F9FB"/>
+          </w:tcPr>
+          <w:p>
+            <w:pPr>
+              <w:jc w:val="center"/>
+            </w:pPr>
+            <w:r>
+              <w:rPr>
+                <w:sz w:val="17"/>
+              </w:rPr>
+              <w:t>79.63 dB</w:t>
+            </w:r>
+          </w:p>
+        </w:tc>
+        <w:tc>
+          <w:tcPr>
+            <w:tcW w:type="dxa" w:w="1170"/>
+            <w:shd w:fill="F7F9FB"/>
+          </w:tcPr>
+          <w:p>
+            <w:pPr>
+              <w:jc w:val="center"/>
+            </w:pPr>
+            <w:r>
+              <w:rPr>
+                <w:sz w:val="17"/>
+              </w:rPr>
+              <w:t>10.62 ms</w:t>
+            </w:r>
+          </w:p>
+        </w:tc>
+        <w:tc>
+          <w:tcPr>
+            <w:tcW w:type="dxa" w:w="1170"/>
+            <w:shd w:fill="F7F9FB"/>
+          </w:tcPr>
+          <w:p>
+            <w:pPr>
+              <w:jc w:val="center"/>
+            </w:pPr>
+            <w:r>
+              <w:rPr>
+                <w:sz w:val="17"/>
+              </w:rPr>
+              <w:t>60.56 dB</w:t>
+            </w:r>
+          </w:p>
+        </w:tc>
+        <w:tc>
+          <w:tcPr>
+            <w:tcW w:type="dxa" w:w="1170"/>
+            <w:shd w:fill="F7F9FB"/>
+          </w:tcPr>
+          <w:p>
+            <w:pPr>
+              <w:jc w:val="center"/>
+            </w:pPr>
+            <w:r>
+              <w:rPr>
+                <w:sz w:val="17"/>
+              </w:rPr>
+              <w:t>100%</w:t>
+            </w:r>
+          </w:p>
+        </w:tc>
+        <w:tc>
+          <w:tcPr>
+            <w:tcW w:type="dxa" w:w="1170"/>
+            <w:shd w:fill="F7F9FB"/>
+          </w:tcPr>
+          <w:p>
+            <w:pPr>
+              <w:jc w:val="center"/>
+            </w:pPr>
+            <w:r>
+              <w:rPr>
+                <w:sz w:val="17"/>
+              </w:rPr>
+              <w:t>Intact (Valid RIFF)</w:t>
+            </w:r>
+          </w:p>
+        </w:tc>
+      </w:tr>
+      <w:tr>
+        <w:tc>
+          <w:tcPr>
+            <w:tcW w:type="dxa" w:w="1170"/>
+            <w:shd w:fill="FFFFFF"/>
+          </w:tcPr>
+          <w:p>
+            <w:pPr>
+              <w:jc w:val="left"/>
+            </w:pPr>
+            <w:r>
+              <w:rPr>
+                <w:sz w:val="17"/>
+              </w:rPr>
+              <w:t>2 KB</w:t>
+            </w:r>
+          </w:p>
+        </w:tc>
+        <w:tc>
+          <w:tcPr>
+            <w:tcW w:type="dxa" w:w="1170"/>
+            <w:shd w:fill="FFFFFF"/>
+          </w:tcPr>
+          <w:p>
+            <w:pPr>
+              <w:jc w:val="center"/>
+            </w:pPr>
+            <w:r>
+              <w:rPr>
+                <w:sz w:val="17"/>
+              </w:rPr>
+              <w:t>290.87 ms</w:t>
+            </w:r>
+          </w:p>
+        </w:tc>
+        <w:tc>
+          <w:tcPr>
+            <w:tcW w:type="dxa" w:w="1170"/>
+            <w:shd w:fill="FFFFFF"/>
+          </w:tcPr>
+          <w:p>
+            <w:pPr>
+              <w:jc w:val="center"/>
+            </w:pPr>
+            <w:r>
+              <w:rPr>
+                <w:sz w:val="17"/>
+              </w:rPr>
+              <w:t>184.00 ms</w:t>
+            </w:r>
+          </w:p>
+        </w:tc>
+        <w:tc>
+          <w:tcPr>
+            <w:tcW w:type="dxa" w:w="1170"/>
+            <w:shd w:fill="FFFFFF"/>
+          </w:tcPr>
+          <w:p>
+            <w:pPr>
+              <w:jc w:val="center"/>
+            </w:pPr>
+            <w:r>
+              <w:rPr>
+                <w:sz w:val="17"/>
+              </w:rPr>
+              <w:t>73.91 dB</w:t>
+            </w:r>
+          </w:p>
+        </w:tc>
+        <w:tc>
+          <w:tcPr>
+            <w:tcW w:type="dxa" w:w="1170"/>
+            <w:shd w:fill="FFFFFF"/>
+          </w:tcPr>
+          <w:p>
+            <w:pPr>
+              <w:jc w:val="center"/>
+            </w:pPr>
+            <w:r>
+              <w:rPr>
+                <w:sz w:val="17"/>
+              </w:rPr>
+              <w:t>10.63 ms</w:t>
+            </w:r>
+          </w:p>
+        </w:tc>
+        <w:tc>
+          <w:tcPr>
+            <w:tcW w:type="dxa" w:w="1170"/>
+            <w:shd w:fill="FFFFFF"/>
+          </w:tcPr>
+          <w:p>
+            <w:pPr>
+              <w:jc w:val="center"/>
+            </w:pPr>
+            <w:r>
+              <w:rPr>
+                <w:sz w:val="17"/>
+              </w:rPr>
+              <w:t>54.69 dB</w:t>
+            </w:r>
+          </w:p>
+        </w:tc>
+        <w:tc>
+          <w:tcPr>
+            <w:tcW w:type="dxa" w:w="1170"/>
+            <w:shd w:fill="FFFFFF"/>
+          </w:tcPr>
+          <w:p>
+            <w:pPr>
+              <w:jc w:val="center"/>
+            </w:pPr>
+            <w:r>
+              <w:rPr>
+                <w:sz w:val="17"/>
+              </w:rPr>
+              <w:t>100%</w:t>
+            </w:r>
+          </w:p>
+        </w:tc>
+        <w:tc>
+          <w:tcPr>
+            <w:tcW w:type="dxa" w:w="1170"/>
+            <w:shd w:fill="FFFFFF"/>
+          </w:tcPr>
+          <w:p>
+            <w:pPr>
+              <w:jc w:val="center"/>
+            </w:pPr>
+            <w:r>
+              <w:rPr>
+                <w:sz w:val="17"/>
+              </w:rPr>
+              <w:t>Intact (Valid RIFF)</w:t>
+            </w:r>
+          </w:p>
+        </w:tc>
+      </w:tr>
+      <w:tr>
+        <w:tc>
+          <w:tcPr>
+            <w:tcW w:type="dxa" w:w="1170"/>
+            <w:shd w:fill="F7F9FB"/>
+          </w:tcPr>
+          <w:p>
+            <w:pPr>
+              <w:jc w:val="left"/>
+            </w:pPr>
+            <w:r>
+              <w:rPr>
+                <w:sz w:val="17"/>
+              </w:rPr>
+              <w:t>8 KB</w:t>
+            </w:r>
+          </w:p>
+        </w:tc>
+        <w:tc>
+          <w:tcPr>
+            <w:tcW w:type="dxa" w:w="1170"/>
+            <w:shd w:fill="F7F9FB"/>
+          </w:tcPr>
+          <w:p>
+            <w:pPr>
+              <w:jc w:val="center"/>
+            </w:pPr>
+            <w:r>
+              <w:rPr>
+                <w:sz w:val="17"/>
+              </w:rPr>
+              <w:t>299.59 ms</w:t>
+            </w:r>
+          </w:p>
+        </w:tc>
+        <w:tc>
+          <w:tcPr>
+            <w:tcW w:type="dxa" w:w="1170"/>
+            <w:shd w:fill="F7F9FB"/>
+          </w:tcPr>
+          <w:p>
+            <w:pPr>
+              <w:jc w:val="center"/>
+            </w:pPr>
+            <w:r>
+              <w:rPr>
+                <w:sz w:val="17"/>
+              </w:rPr>
+              <w:t>196.98 ms</w:t>
+            </w:r>
+          </w:p>
+        </w:tc>
+        <w:tc>
+          <w:tcPr>
+            <w:tcW w:type="dxa" w:w="1170"/>
+            <w:shd w:fill="F7F9FB"/>
+          </w:tcPr>
+          <w:p>
+            <w:pPr>
+              <w:jc w:val="center"/>
+            </w:pPr>
+            <w:r>
+              <w:rPr>
+                <w:sz w:val="17"/>
+              </w:rPr>
+              <w:t>67.92 dB</w:t>
+            </w:r>
+          </w:p>
+        </w:tc>
+        <w:tc>
+          <w:tcPr>
+            <w:tcW w:type="dxa" w:w="1170"/>
+            <w:shd w:fill="F7F9FB"/>
+          </w:tcPr>
+          <w:p>
+            <w:pPr>
+              <w:jc w:val="center"/>
+            </w:pPr>
+            <w:r>
+              <w:rPr>
+                <w:sz w:val="17"/>
+              </w:rPr>
+              <w:t>26.91 ms</w:t>
+            </w:r>
+          </w:p>
+        </w:tc>
+        <w:tc>
+          <w:tcPr>
+            <w:tcW w:type="dxa" w:w="1170"/>
+            <w:shd w:fill="F7F9FB"/>
+          </w:tcPr>
+          <w:p>
+            <w:pPr>
+              <w:jc w:val="center"/>
+            </w:pPr>
+            <w:r>
+              <w:rPr>
+                <w:sz w:val="17"/>
+              </w:rPr>
+              <w:t>48.74 dB</w:t>
+            </w:r>
+          </w:p>
+        </w:tc>
+        <w:tc>
+          <w:tcPr>
+            <w:tcW w:type="dxa" w:w="1170"/>
+            <w:shd w:fill="F7F9FB"/>
+          </w:tcPr>
+          <w:p>
+            <w:pPr>
+              <w:jc w:val="center"/>
+            </w:pPr>
+            <w:r>
+              <w:rPr>
+                <w:sz w:val="17"/>
+              </w:rPr>
+              <w:t>100%</w:t>
+            </w:r>
+          </w:p>
+        </w:tc>
+        <w:tc>
+          <w:tcPr>
+            <w:tcW w:type="dxa" w:w="1170"/>
+            <w:shd w:fill="F7F9FB"/>
+          </w:tcPr>
+          <w:p>
+            <w:pPr>
+              <w:jc w:val="center"/>
+            </w:pPr>
+            <w:r>
+              <w:rPr>
+                <w:sz w:val="17"/>
+              </w:rPr>
+              <w:t>Intact (Valid RIFF)</w:t>
+            </w:r>
+          </w:p>
+        </w:tc>
+      </w:tr>
+      <w:tr>
+        <w:tc>
+          <w:tcPr>
+            <w:tcW w:type="dxa" w:w="1170"/>
+            <w:shd w:fill="FFFFFF"/>
+          </w:tcPr>
+          <w:p>
+            <w:pPr>
+              <w:jc w:val="left"/>
+            </w:pPr>
+            <w:r>
+              <w:rPr>
+                <w:sz w:val="17"/>
+              </w:rPr>
+              <w:t>32 KB</w:t>
+            </w:r>
+          </w:p>
+        </w:tc>
+        <w:tc>
+          <w:tcPr>
+            <w:tcW w:type="dxa" w:w="1170"/>
+            <w:shd w:fill="FFFFFF"/>
+          </w:tcPr>
+          <w:p>
+            <w:pPr>
+              <w:jc w:val="center"/>
+            </w:pPr>
+            <w:r>
+              <w:rPr>
+                <w:sz w:val="17"/>
+              </w:rPr>
+              <w:t>305.09 ms</w:t>
+            </w:r>
+          </w:p>
+        </w:tc>
+        <w:tc>
+          <w:tcPr>
+            <w:tcW w:type="dxa" w:w="1170"/>
+            <w:shd w:fill="FFFFFF"/>
+          </w:tcPr>
+          <w:p>
+            <w:pPr>
+              <w:jc w:val="center"/>
+            </w:pPr>
+            <w:r>
+              <w:rPr>
+                <w:sz w:val="17"/>
+              </w:rPr>
+              <w:t>212.63 ms</w:t>
+            </w:r>
+          </w:p>
+        </w:tc>
+        <w:tc>
+          <w:tcPr>
+            <w:tcW w:type="dxa" w:w="1170"/>
+            <w:shd w:fill="FFFFFF"/>
+          </w:tcPr>
+          <w:p>
+            <w:pPr>
+              <w:jc w:val="center"/>
+            </w:pPr>
+            <w:r>
+              <w:rPr>
+                <w:sz w:val="17"/>
+              </w:rPr>
+              <w:t>61.93 dB</w:t>
+            </w:r>
+          </w:p>
+        </w:tc>
+        <w:tc>
+          <w:tcPr>
+            <w:tcW w:type="dxa" w:w="1170"/>
+            <w:shd w:fill="FFFFFF"/>
+          </w:tcPr>
+          <w:p>
+            <w:pPr>
+              <w:jc w:val="center"/>
+            </w:pPr>
+            <w:r>
+              <w:rPr>
+                <w:sz w:val="17"/>
+              </w:rPr>
+              <w:t>45.03 ms</w:t>
+            </w:r>
+          </w:p>
+        </w:tc>
+        <w:tc>
+          <w:tcPr>
+            <w:tcW w:type="dxa" w:w="1170"/>
+            <w:shd w:fill="FFFFFF"/>
+          </w:tcPr>
+          <w:p>
+            <w:pPr>
+              <w:jc w:val="center"/>
+            </w:pPr>
+            <w:r>
+              <w:rPr>
+                <w:sz w:val="17"/>
+              </w:rPr>
+              <w:t>42.74 dB</w:t>
+            </w:r>
+          </w:p>
+        </w:tc>
+        <w:tc>
+          <w:tcPr>
+            <w:tcW w:type="dxa" w:w="1170"/>
+            <w:shd w:fill="FFFFFF"/>
+          </w:tcPr>
+          <w:p>
+            <w:pPr>
+              <w:jc w:val="center"/>
+            </w:pPr>
+            <w:r>
+              <w:rPr>
+                <w:sz w:val="17"/>
+              </w:rPr>
+              <w:t>100%</w:t>
+            </w:r>
+          </w:p>
+        </w:tc>
+        <w:tc>
+          <w:tcPr>
+            <w:tcW w:type="dxa" w:w="1170"/>
+            <w:shd w:fill="FFFFFF"/>
+          </w:tcPr>
+          <w:p>
+            <w:pPr>
+              <w:jc w:val="center"/>
+            </w:pPr>
+            <w:r>
+              <w:rPr>
+                <w:sz w:val="17"/>
+              </w:rPr>
+              <w:t>Intact (Valid RIFF)</w:t>
+            </w:r>
+          </w:p>
+        </w:tc>
+      </w:tr>
+    </w:tbl>
+    <w:p>
+      <w:pPr>
+        <w:spacing w:after="160"/>
+      </w:pPr>
+    </w:p>
+    <w:p>
+      <w:pPr>
+        <w:pStyle w:val="Heading2"/>
+        <w:spacing w:after="120"/>
+      </w:pPr>
+      <w:r>
+        <w:rPr>
+          <w:b/>
+        </w:rPr>
+        <w:t>4.6.1 Perceptual and Acoustic Transparency</w:t>
+      </w:r>
+    </w:p>
+    <w:p>
+      <w:pPr>
+        <w:spacing w:after="160"/>
+      </w:pPr>
+      <w:r>
+        <w:t>As documented in Table 4.1, both image and audio steganography achieved exceptional levels of imperceptibility. For image steganography, the Peak Signal-to-Noise Ratio (PSNR) remained consistently between 61.92 dB and 86.44 dB, substantially above the accepted human visual perception threshold of 40 dB. Similarly, the Mean Squared Error (MSE) remained below 0.00015, confirming that LSB modifications did not introduce visible color banding or luminance distortion. In audio steganography, the Signal-to-Noise Ratio (SNR) ranged from 42.75 dB to 67.49 dB, preserving high-fidelity audio reproduction without audible static or phase distortion.</w:t>
+      </w:r>
+    </w:p>
+    <w:p>
+      <w:pPr>
+        <w:pStyle w:val="Heading2"/>
+        <w:spacing w:after="120"/>
+      </w:pPr>
+      <w:r>
+        <w:rPr>
+          <w:b/>
+        </w:rPr>
+        <w:t>4.6.2 Carrier Capacity and Channel Scaling</w:t>
+      </w:r>
+    </w:p>
+    <w:p>
+      <w:pPr>
+        <w:spacing w:after="160"/>
+      </w:pPr>
+      <w:r>
+        <w:t>An investigation into multi-channel embedding demonstrated that transitioning from single-channel Blue embedding to multi-channel RGB embedding expanded data concealing capacity by 300% at 1-bit depth (from 128 KB to 384 KB) with negligible impact on visual quality (PSNR dropped by only 0.27 dB). When scaling bit-depth to 4 LSBs per channel, the image carrier accommodated up to 1,536 KB (1.5 MB)—a 12-fold increase over the baseline—while maintaining a PSNR of 71.15 dB.</w:t>
+      </w:r>
+    </w:p>
+    <w:p>
+      <w:pPr>
+        <w:pStyle w:val="Caption"/>
+        <w:spacing w:after="80"/>
+      </w:pPr>
+      <w:r>
+        <w:rPr>
+          <w:b/>
+        </w:rPr>
+        <w:t>Table 4.2: Image Capacity vs. PSNR Quality Across Bit-Depths</w:t>
+      </w:r>
+    </w:p>
+    <w:tbl>
+      <w:tblPr>
+        <w:tblW w:type="auto" w:w="0"/>
+        <w:jc w:val="center"/>
+        <w:tblLook w:firstColumn="1" w:firstRow="1" w:lastColumn="0" w:lastRow="0" w:noHBand="0" w:noVBand="1" w:val="04A0"/>
+      </w:tblPr>
+      <w:tblGrid>
+        <w:gridCol w:w="1560"/>
+        <w:gridCol w:w="1560"/>
+        <w:gridCol w:w="1560"/>
+        <w:gridCol w:w="1560"/>
+        <w:gridCol w:w="1560"/>
+        <w:gridCol w:w="1560"/>
+      </w:tblGrid>
+      <w:tr>
+        <w:tc>
+          <w:tcPr>
+            <w:tcW w:type="dxa" w:w="1560"/>
+            <w:shd w:fill="2A3950"/>
+          </w:tcPr>
+          <w:p>
+            <w:pPr>
+              <w:jc w:val="center"/>
+            </w:pPr>
+            <w:r>
+              <w:rPr>
+                <w:b/>
+                <w:color w:val="FFFFFF"/>
+                <w:sz w:val="18"/>
+              </w:rPr>
+              <w:t>Channel Configuration</w:t>
+            </w:r>
+          </w:p>
+        </w:tc>
+        <w:tc>
+          <w:tcPr>
+            <w:tcW w:type="dxa" w:w="1560"/>
+            <w:shd w:fill="2A3950"/>
+          </w:tcPr>
+          <w:p>
+            <w:pPr>
+              <w:jc w:val="center"/>
+            </w:pPr>
+            <w:r>
+              <w:rPr>
+                <w:b/>
+                <w:color w:val="FFFFFF"/>
+                <w:sz w:val="18"/>
+              </w:rPr>
+              <w:t>Bit-Depth</w:t>
+            </w:r>
+          </w:p>
+        </w:tc>
+        <w:tc>
+          <w:tcPr>
+            <w:tcW w:type="dxa" w:w="1560"/>
+            <w:shd w:fill="2A3950"/>
+          </w:tcPr>
+          <w:p>
+            <w:pPr>
+              <w:jc w:val="center"/>
+            </w:pPr>
+            <w:r>
+              <w:rPr>
+                <w:b/>
+                <w:color w:val="FFFFFF"/>
+                <w:sz w:val="18"/>
+              </w:rPr>
+              <w:t>Capacity</w:t>
+            </w:r>
+          </w:p>
+        </w:tc>
+        <w:tc>
+          <w:tcPr>
+            <w:tcW w:type="dxa" w:w="1560"/>
+            <w:shd w:fill="2A3950"/>
+          </w:tcPr>
+          <w:p>
+            <w:pPr>
+              <w:jc w:val="center"/>
+            </w:pPr>
+            <w:r>
+              <w:rPr>
+                <w:b/>
+                <w:color w:val="FFFFFF"/>
+                <w:sz w:val="18"/>
+              </w:rPr>
+              <w:t>Multiplier</w:t>
+            </w:r>
+          </w:p>
+        </w:tc>
+        <w:tc>
+          <w:tcPr>
+            <w:tcW w:type="dxa" w:w="1560"/>
+            <w:shd w:fill="2A3950"/>
+          </w:tcPr>
+          <w:p>
+            <w:pPr>
+              <w:jc w:val="center"/>
+            </w:pPr>
+            <w:r>
+              <w:rPr>
+                <w:b/>
+                <w:color w:val="FFFFFF"/>
+                <w:sz w:val="18"/>
+              </w:rPr>
+              <w:t>PSNR (dB)</w:t>
+            </w:r>
+          </w:p>
+        </w:tc>
+        <w:tc>
+          <w:tcPr>
+            <w:tcW w:type="dxa" w:w="1560"/>
+            <w:shd w:fill="2A3950"/>
+          </w:tcPr>
+          <w:p>
+            <w:pPr>
+              <w:jc w:val="center"/>
+            </w:pPr>
+            <w:r>
+              <w:rPr>
+                <w:b/>
+                <w:color w:val="FFFFFF"/>
+                <w:sz w:val="18"/>
+              </w:rPr>
+              <w:t>Visual Distortion</w:t>
+            </w:r>
+          </w:p>
+        </w:tc>
+      </w:tr>
+      <w:tr>
+        <w:tc>
+          <w:tcPr>
+            <w:tcW w:type="dxa" w:w="1560"/>
+            <w:shd w:fill="FFFFFF"/>
+          </w:tcPr>
+          <w:p>
+            <w:pPr>
+              <w:jc w:val="left"/>
+            </w:pPr>
+            <w:r>
+              <w:rPr>
+                <w:sz w:val="17"/>
+              </w:rPr>
+              <w:t>Blue (1 channel)</w:t>
+            </w:r>
+          </w:p>
+        </w:tc>
+        <w:tc>
+          <w:tcPr>
+            <w:tcW w:type="dxa" w:w="1560"/>
+            <w:shd w:fill="FFFFFF"/>
+          </w:tcPr>
+          <w:p>
+            <w:pPr>
+              <w:jc w:val="center"/>
+            </w:pPr>
+            <w:r>
+              <w:rPr>
+                <w:sz w:val="17"/>
+              </w:rPr>
+              <w:t>1 bit</w:t>
+            </w:r>
+          </w:p>
+        </w:tc>
+        <w:tc>
+          <w:tcPr>
+            <w:tcW w:type="dxa" w:w="1560"/>
+            <w:shd w:fill="FFFFFF"/>
+          </w:tcPr>
+          <w:p>
+            <w:pPr>
+              <w:jc w:val="center"/>
+            </w:pPr>
+            <w:r>
+              <w:rPr>
+                <w:sz w:val="17"/>
+              </w:rPr>
+              <w:t>128 KB</w:t>
+            </w:r>
+          </w:p>
+        </w:tc>
+        <w:tc>
+          <w:tcPr>
+            <w:tcW w:type="dxa" w:w="1560"/>
+            <w:shd w:fill="FFFFFF"/>
+          </w:tcPr>
+          <w:p>
+            <w:pPr>
+              <w:jc w:val="center"/>
+            </w:pPr>
+            <w:r>
+              <w:rPr>
+                <w:sz w:val="17"/>
+              </w:rPr>
+              <w:t>1x (Baseline)</w:t>
+            </w:r>
+          </w:p>
+        </w:tc>
+        <w:tc>
+          <w:tcPr>
+            <w:tcW w:type="dxa" w:w="1560"/>
+            <w:shd w:fill="FFFFFF"/>
+          </w:tcPr>
+          <w:p>
+            <w:pPr>
+              <w:jc w:val="center"/>
+            </w:pPr>
+            <w:r>
+              <w:rPr>
+                <w:sz w:val="17"/>
+              </w:rPr>
+              <w:t>85.14 dB</w:t>
+            </w:r>
+          </w:p>
+        </w:tc>
+        <w:tc>
+          <w:tcPr>
+            <w:tcW w:type="dxa" w:w="1560"/>
+            <w:shd w:fill="FFFFFF"/>
+          </w:tcPr>
+          <w:p>
+            <w:pPr>
+              <w:jc w:val="center"/>
+            </w:pPr>
+            <w:r>
+              <w:rPr>
+                <w:sz w:val="17"/>
+              </w:rPr>
+              <w:t>Completely Imperceptible</w:t>
+            </w:r>
+          </w:p>
+        </w:tc>
+      </w:tr>
+      <w:tr>
+        <w:tc>
+          <w:tcPr>
+            <w:tcW w:type="dxa" w:w="1560"/>
+            <w:shd w:fill="F7F9FB"/>
+          </w:tcPr>
+          <w:p>
+            <w:pPr>
+              <w:jc w:val="left"/>
+            </w:pPr>
+            <w:r>
+              <w:rPr>
+                <w:sz w:val="17"/>
+              </w:rPr>
+              <w:t>Blue (1 channel)</w:t>
+            </w:r>
+          </w:p>
+        </w:tc>
+        <w:tc>
+          <w:tcPr>
+            <w:tcW w:type="dxa" w:w="1560"/>
+            <w:shd w:fill="F7F9FB"/>
+          </w:tcPr>
+          <w:p>
+            <w:pPr>
+              <w:jc w:val="center"/>
+            </w:pPr>
+            <w:r>
+              <w:rPr>
+                <w:sz w:val="17"/>
+              </w:rPr>
+              <w:t>2 bits</w:t>
+            </w:r>
+          </w:p>
+        </w:tc>
+        <w:tc>
+          <w:tcPr>
+            <w:tcW w:type="dxa" w:w="1560"/>
+            <w:shd w:fill="F7F9FB"/>
+          </w:tcPr>
+          <w:p>
+            <w:pPr>
+              <w:jc w:val="center"/>
+            </w:pPr>
+            <w:r>
+              <w:rPr>
+                <w:sz w:val="17"/>
+              </w:rPr>
+              <w:t>256 KB</w:t>
+            </w:r>
+          </w:p>
+        </w:tc>
+        <w:tc>
+          <w:tcPr>
+            <w:tcW w:type="dxa" w:w="1560"/>
+            <w:shd w:fill="F7F9FB"/>
+          </w:tcPr>
+          <w:p>
+            <w:pPr>
+              <w:jc w:val="center"/>
+            </w:pPr>
+            <w:r>
+              <w:rPr>
+                <w:sz w:val="17"/>
+              </w:rPr>
+              <w:t>2x</w:t>
+            </w:r>
+          </w:p>
+        </w:tc>
+        <w:tc>
+          <w:tcPr>
+            <w:tcW w:type="dxa" w:w="1560"/>
+            <w:shd w:fill="F7F9FB"/>
+          </w:tcPr>
+          <w:p>
+            <w:pPr>
+              <w:jc w:val="center"/>
+            </w:pPr>
+            <w:r>
+              <w:rPr>
+                <w:sz w:val="17"/>
+              </w:rPr>
+              <w:t>80.99 dB</w:t>
+            </w:r>
+          </w:p>
+        </w:tc>
+        <w:tc>
+          <w:tcPr>
+            <w:tcW w:type="dxa" w:w="1560"/>
+            <w:shd w:fill="F7F9FB"/>
+          </w:tcPr>
+          <w:p>
+            <w:pPr>
+              <w:jc w:val="center"/>
+            </w:pPr>
+            <w:r>
+              <w:rPr>
+                <w:sz w:val="17"/>
+              </w:rPr>
+              <w:t>Completely Imperceptible</w:t>
+            </w:r>
+          </w:p>
+        </w:tc>
+      </w:tr>
+      <w:tr>
+        <w:tc>
+          <w:tcPr>
+            <w:tcW w:type="dxa" w:w="1560"/>
+            <w:shd w:fill="FFFFFF"/>
+          </w:tcPr>
+          <w:p>
+            <w:pPr>
+              <w:jc w:val="left"/>
+            </w:pPr>
+            <w:r>
+              <w:rPr>
+                <w:sz w:val="17"/>
+              </w:rPr>
+              <w:t>Blue (1 channel)</w:t>
+            </w:r>
+          </w:p>
+        </w:tc>
+        <w:tc>
+          <w:tcPr>
+            <w:tcW w:type="dxa" w:w="1560"/>
+            <w:shd w:fill="FFFFFF"/>
+          </w:tcPr>
+          <w:p>
+            <w:pPr>
+              <w:jc w:val="center"/>
+            </w:pPr>
+            <w:r>
+              <w:rPr>
+                <w:sz w:val="17"/>
+              </w:rPr>
+              <w:t>3 bits</w:t>
+            </w:r>
+          </w:p>
+        </w:tc>
+        <w:tc>
+          <w:tcPr>
+            <w:tcW w:type="dxa" w:w="1560"/>
+            <w:shd w:fill="FFFFFF"/>
+          </w:tcPr>
+          <w:p>
+            <w:pPr>
+              <w:jc w:val="center"/>
+            </w:pPr>
+            <w:r>
+              <w:rPr>
+                <w:sz w:val="17"/>
+              </w:rPr>
+              <w:t>384 KB</w:t>
+            </w:r>
+          </w:p>
+        </w:tc>
+        <w:tc>
+          <w:tcPr>
+            <w:tcW w:type="dxa" w:w="1560"/>
+            <w:shd w:fill="FFFFFF"/>
+          </w:tcPr>
+          <w:p>
+            <w:pPr>
+              <w:jc w:val="center"/>
+            </w:pPr>
+            <w:r>
+              <w:rPr>
+                <w:sz w:val="17"/>
+              </w:rPr>
+              <w:t>3x</w:t>
+            </w:r>
+          </w:p>
+        </w:tc>
+        <w:tc>
+          <w:tcPr>
+            <w:tcW w:type="dxa" w:w="1560"/>
+            <w:shd w:fill="FFFFFF"/>
+          </w:tcPr>
+          <w:p>
+            <w:pPr>
+              <w:jc w:val="center"/>
+            </w:pPr>
+            <w:r>
+              <w:rPr>
+                <w:sz w:val="17"/>
+              </w:rPr>
+              <w:t>76.44 dB</w:t>
+            </w:r>
+          </w:p>
+        </w:tc>
+        <w:tc>
+          <w:tcPr>
+            <w:tcW w:type="dxa" w:w="1560"/>
+            <w:shd w:fill="FFFFFF"/>
+          </w:tcPr>
+          <w:p>
+            <w:pPr>
+              <w:jc w:val="center"/>
+            </w:pPr>
+            <w:r>
+              <w:rPr>
+                <w:sz w:val="17"/>
+              </w:rPr>
+              <w:t>Completely Imperceptible</w:t>
+            </w:r>
+          </w:p>
+        </w:tc>
+      </w:tr>
+      <w:tr>
+        <w:tc>
+          <w:tcPr>
+            <w:tcW w:type="dxa" w:w="1560"/>
+            <w:shd w:fill="F7F9FB"/>
+          </w:tcPr>
+          <w:p>
+            <w:pPr>
+              <w:jc w:val="left"/>
+            </w:pPr>
+            <w:r>
+              <w:rPr>
+                <w:sz w:val="17"/>
+              </w:rPr>
+              <w:t>Blue (1 channel)</w:t>
+            </w:r>
+          </w:p>
+        </w:tc>
+        <w:tc>
+          <w:tcPr>
+            <w:tcW w:type="dxa" w:w="1560"/>
+            <w:shd w:fill="F7F9FB"/>
+          </w:tcPr>
+          <w:p>
+            <w:pPr>
+              <w:jc w:val="center"/>
+            </w:pPr>
+            <w:r>
+              <w:rPr>
+                <w:sz w:val="17"/>
+              </w:rPr>
+              <w:t>4 bits</w:t>
+            </w:r>
+          </w:p>
+        </w:tc>
+        <w:tc>
+          <w:tcPr>
+            <w:tcW w:type="dxa" w:w="1560"/>
+            <w:shd w:fill="F7F9FB"/>
+          </w:tcPr>
+          <w:p>
+            <w:pPr>
+              <w:jc w:val="center"/>
+            </w:pPr>
+            <w:r>
+              <w:rPr>
+                <w:sz w:val="17"/>
+              </w:rPr>
+              <w:t>512 KB</w:t>
+            </w:r>
+          </w:p>
+        </w:tc>
+        <w:tc>
+          <w:tcPr>
+            <w:tcW w:type="dxa" w:w="1560"/>
+            <w:shd w:fill="F7F9FB"/>
+          </w:tcPr>
+          <w:p>
+            <w:pPr>
+              <w:jc w:val="center"/>
+            </w:pPr>
+            <w:r>
+              <w:rPr>
+                <w:sz w:val="17"/>
+              </w:rPr>
+              <w:t>4x</w:t>
+            </w:r>
+          </w:p>
+        </w:tc>
+        <w:tc>
+          <w:tcPr>
+            <w:tcW w:type="dxa" w:w="1560"/>
+            <w:shd w:fill="F7F9FB"/>
+          </w:tcPr>
+          <w:p>
+            <w:pPr>
+              <w:jc w:val="center"/>
+            </w:pPr>
+            <w:r>
+              <w:rPr>
+                <w:sz w:val="17"/>
+              </w:rPr>
+              <w:t>71.34 dB</w:t>
+            </w:r>
+          </w:p>
+        </w:tc>
+        <w:tc>
+          <w:tcPr>
+            <w:tcW w:type="dxa" w:w="1560"/>
+            <w:shd w:fill="F7F9FB"/>
+          </w:tcPr>
+          <w:p>
+            <w:pPr>
+              <w:jc w:val="center"/>
+            </w:pPr>
+            <w:r>
+              <w:rPr>
+                <w:sz w:val="17"/>
+              </w:rPr>
+              <w:t>Completely Imperceptible</w:t>
+            </w:r>
+          </w:p>
+        </w:tc>
+      </w:tr>
+      <w:tr>
+        <w:tc>
+          <w:tcPr>
+            <w:tcW w:type="dxa" w:w="1560"/>
+            <w:shd w:fill="FFFFFF"/>
+          </w:tcPr>
+          <w:p>
+            <w:pPr>
+              <w:jc w:val="left"/>
+            </w:pPr>
+            <w:r>
+              <w:rPr>
+                <w:sz w:val="17"/>
+              </w:rPr>
+              <w:t>RGB (3 channels)</w:t>
+            </w:r>
+          </w:p>
+        </w:tc>
+        <w:tc>
+          <w:tcPr>
+            <w:tcW w:type="dxa" w:w="1560"/>
+            <w:shd w:fill="FFFFFF"/>
+          </w:tcPr>
+          <w:p>
+            <w:pPr>
+              <w:jc w:val="center"/>
+            </w:pPr>
+            <w:r>
+              <w:rPr>
+                <w:sz w:val="17"/>
+              </w:rPr>
+              <w:t>1 bit</w:t>
+            </w:r>
+          </w:p>
+        </w:tc>
+        <w:tc>
+          <w:tcPr>
+            <w:tcW w:type="dxa" w:w="1560"/>
+            <w:shd w:fill="FFFFFF"/>
+          </w:tcPr>
+          <w:p>
+            <w:pPr>
+              <w:jc w:val="center"/>
+            </w:pPr>
+            <w:r>
+              <w:rPr>
+                <w:sz w:val="17"/>
+              </w:rPr>
+              <w:t>384 KB</w:t>
+            </w:r>
+          </w:p>
+        </w:tc>
+        <w:tc>
+          <w:tcPr>
+            <w:tcW w:type="dxa" w:w="1560"/>
+            <w:shd w:fill="FFFFFF"/>
+          </w:tcPr>
+          <w:p>
+            <w:pPr>
+              <w:jc w:val="center"/>
+            </w:pPr>
+            <w:r>
+              <w:rPr>
+                <w:sz w:val="17"/>
+              </w:rPr>
+              <w:t>3x</w:t>
+            </w:r>
+          </w:p>
+        </w:tc>
+        <w:tc>
+          <w:tcPr>
+            <w:tcW w:type="dxa" w:w="1560"/>
+            <w:shd w:fill="FFFFFF"/>
+          </w:tcPr>
+          <w:p>
+            <w:pPr>
+              <w:jc w:val="center"/>
+            </w:pPr>
+            <w:r>
+              <w:rPr>
+                <w:sz w:val="17"/>
+              </w:rPr>
+              <w:t>84.87 dB</w:t>
+            </w:r>
+          </w:p>
+        </w:tc>
+        <w:tc>
+          <w:tcPr>
+            <w:tcW w:type="dxa" w:w="1560"/>
+            <w:shd w:fill="FFFFFF"/>
+          </w:tcPr>
+          <w:p>
+            <w:pPr>
+              <w:jc w:val="center"/>
+            </w:pPr>
+            <w:r>
+              <w:rPr>
+                <w:sz w:val="17"/>
+              </w:rPr>
+              <w:t>Completely Imperceptible</w:t>
+            </w:r>
+          </w:p>
+        </w:tc>
+      </w:tr>
+      <w:tr>
+        <w:tc>
+          <w:tcPr>
+            <w:tcW w:type="dxa" w:w="1560"/>
+            <w:shd w:fill="F7F9FB"/>
+          </w:tcPr>
+          <w:p>
+            <w:pPr>
+              <w:jc w:val="left"/>
+            </w:pPr>
+            <w:r>
+              <w:rPr>
+                <w:sz w:val="17"/>
+              </w:rPr>
+              <w:t>RGB (3 channels)</w:t>
+            </w:r>
+          </w:p>
+        </w:tc>
+        <w:tc>
+          <w:tcPr>
+            <w:tcW w:type="dxa" w:w="1560"/>
+            <w:shd w:fill="F7F9FB"/>
+          </w:tcPr>
+          <w:p>
+            <w:pPr>
+              <w:jc w:val="center"/>
+            </w:pPr>
+            <w:r>
+              <w:rPr>
+                <w:sz w:val="17"/>
+              </w:rPr>
+              <w:t>2 bits</w:t>
+            </w:r>
+          </w:p>
+        </w:tc>
+        <w:tc>
+          <w:tcPr>
+            <w:tcW w:type="dxa" w:w="1560"/>
+            <w:shd w:fill="F7F9FB"/>
+          </w:tcPr>
+          <w:p>
+            <w:pPr>
+              <w:jc w:val="center"/>
+            </w:pPr>
+            <w:r>
+              <w:rPr>
+                <w:sz w:val="17"/>
+              </w:rPr>
+              <w:t>768 KB</w:t>
+            </w:r>
+          </w:p>
+        </w:tc>
+        <w:tc>
+          <w:tcPr>
+            <w:tcW w:type="dxa" w:w="1560"/>
+            <w:shd w:fill="F7F9FB"/>
+          </w:tcPr>
+          <w:p>
+            <w:pPr>
+              <w:jc w:val="center"/>
+            </w:pPr>
+            <w:r>
+              <w:rPr>
+                <w:sz w:val="17"/>
+              </w:rPr>
+              <w:t>6x</w:t>
+            </w:r>
+          </w:p>
+        </w:tc>
+        <w:tc>
+          <w:tcPr>
+            <w:tcW w:type="dxa" w:w="1560"/>
+            <w:shd w:fill="F7F9FB"/>
+          </w:tcPr>
+          <w:p>
+            <w:pPr>
+              <w:jc w:val="center"/>
+            </w:pPr>
+            <w:r>
+              <w:rPr>
+                <w:sz w:val="17"/>
+              </w:rPr>
+              <w:t>81.12 dB</w:t>
+            </w:r>
+          </w:p>
+        </w:tc>
+        <w:tc>
+          <w:tcPr>
+            <w:tcW w:type="dxa" w:w="1560"/>
+            <w:shd w:fill="F7F9FB"/>
+          </w:tcPr>
+          <w:p>
+            <w:pPr>
+              <w:jc w:val="center"/>
+            </w:pPr>
+            <w:r>
+              <w:rPr>
+                <w:sz w:val="17"/>
+              </w:rPr>
+              <w:t>Completely Imperceptible</w:t>
+            </w:r>
+          </w:p>
+        </w:tc>
+      </w:tr>
+      <w:tr>
+        <w:tc>
+          <w:tcPr>
+            <w:tcW w:type="dxa" w:w="1560"/>
+            <w:shd w:fill="FFFFFF"/>
+          </w:tcPr>
+          <w:p>
+            <w:pPr>
+              <w:jc w:val="left"/>
+            </w:pPr>
+            <w:r>
+              <w:rPr>
+                <w:sz w:val="17"/>
+              </w:rPr>
+              <w:t>RGB (3 channels)</w:t>
+            </w:r>
+          </w:p>
+        </w:tc>
+        <w:tc>
+          <w:tcPr>
+            <w:tcW w:type="dxa" w:w="1560"/>
+            <w:shd w:fill="FFFFFF"/>
+          </w:tcPr>
+          <w:p>
+            <w:pPr>
+              <w:jc w:val="center"/>
+            </w:pPr>
+            <w:r>
+              <w:rPr>
+                <w:sz w:val="17"/>
+              </w:rPr>
+              <w:t>3 bits</w:t>
+            </w:r>
+          </w:p>
+        </w:tc>
+        <w:tc>
+          <w:tcPr>
+            <w:tcW w:type="dxa" w:w="1560"/>
+            <w:shd w:fill="FFFFFF"/>
+          </w:tcPr>
+          <w:p>
+            <w:pPr>
+              <w:jc w:val="center"/>
+            </w:pPr>
+            <w:r>
+              <w:rPr>
+                <w:sz w:val="17"/>
+              </w:rPr>
+              <w:t>1,152 KB</w:t>
+            </w:r>
+          </w:p>
+        </w:tc>
+        <w:tc>
+          <w:tcPr>
+            <w:tcW w:type="dxa" w:w="1560"/>
+            <w:shd w:fill="FFFFFF"/>
+          </w:tcPr>
+          <w:p>
+            <w:pPr>
+              <w:jc w:val="center"/>
+            </w:pPr>
+            <w:r>
+              <w:rPr>
+                <w:sz w:val="17"/>
+              </w:rPr>
+              <w:t>9x</w:t>
+            </w:r>
+          </w:p>
+        </w:tc>
+        <w:tc>
+          <w:tcPr>
+            <w:tcW w:type="dxa" w:w="1560"/>
+            <w:shd w:fill="FFFFFF"/>
+          </w:tcPr>
+          <w:p>
+            <w:pPr>
+              <w:jc w:val="center"/>
+            </w:pPr>
+            <w:r>
+              <w:rPr>
+                <w:sz w:val="17"/>
+              </w:rPr>
+              <w:t>76.53 dB</w:t>
+            </w:r>
+          </w:p>
+        </w:tc>
+        <w:tc>
+          <w:tcPr>
+            <w:tcW w:type="dxa" w:w="1560"/>
+            <w:shd w:fill="FFFFFF"/>
+          </w:tcPr>
+          <w:p>
+            <w:pPr>
+              <w:jc w:val="center"/>
+            </w:pPr>
+            <w:r>
+              <w:rPr>
+                <w:sz w:val="17"/>
+              </w:rPr>
+              <w:t>Completely Imperceptible</w:t>
+            </w:r>
+          </w:p>
+        </w:tc>
+      </w:tr>
+      <w:tr>
+        <w:tc>
+          <w:tcPr>
+            <w:tcW w:type="dxa" w:w="1560"/>
+            <w:shd w:fill="F7F9FB"/>
+          </w:tcPr>
+          <w:p>
+            <w:pPr>
+              <w:jc w:val="left"/>
+            </w:pPr>
+            <w:r>
+              <w:rPr>
+                <w:sz w:val="17"/>
+              </w:rPr>
+              <w:t>RGB (3 channels)</w:t>
+            </w:r>
+          </w:p>
+        </w:tc>
+        <w:tc>
+          <w:tcPr>
+            <w:tcW w:type="dxa" w:w="1560"/>
+            <w:shd w:fill="F7F9FB"/>
+          </w:tcPr>
+          <w:p>
+            <w:pPr>
+              <w:jc w:val="center"/>
+            </w:pPr>
+            <w:r>
+              <w:rPr>
+                <w:sz w:val="17"/>
+              </w:rPr>
+              <w:t>4 bits</w:t>
+            </w:r>
+          </w:p>
+        </w:tc>
+        <w:tc>
+          <w:tcPr>
+            <w:tcW w:type="dxa" w:w="1560"/>
+            <w:shd w:fill="F7F9FB"/>
+          </w:tcPr>
+          <w:p>
+            <w:pPr>
+              <w:jc w:val="center"/>
+            </w:pPr>
+            <w:r>
+              <w:rPr>
+                <w:sz w:val="17"/>
+              </w:rPr>
+              <w:t>1,536 KB</w:t>
+            </w:r>
+          </w:p>
+        </w:tc>
+        <w:tc>
+          <w:tcPr>
+            <w:tcW w:type="dxa" w:w="1560"/>
+            <w:shd w:fill="F7F9FB"/>
+          </w:tcPr>
+          <w:p>
+            <w:pPr>
+              <w:jc w:val="center"/>
+            </w:pPr>
+            <w:r>
+              <w:rPr>
+                <w:sz w:val="17"/>
+              </w:rPr>
+              <w:t>12x</w:t>
+            </w:r>
+          </w:p>
+        </w:tc>
+        <w:tc>
+          <w:tcPr>
+            <w:tcW w:type="dxa" w:w="1560"/>
+            <w:shd w:fill="F7F9FB"/>
+          </w:tcPr>
+          <w:p>
+            <w:pPr>
+              <w:jc w:val="center"/>
+            </w:pPr>
+            <w:r>
+              <w:rPr>
+                <w:sz w:val="17"/>
+              </w:rPr>
+              <w:t>71.15 dB</w:t>
+            </w:r>
+          </w:p>
+        </w:tc>
+        <w:tc>
+          <w:tcPr>
+            <w:tcW w:type="dxa" w:w="1560"/>
+            <w:shd w:fill="F7F9FB"/>
+          </w:tcPr>
+          <w:p>
+            <w:pPr>
+              <w:jc w:val="center"/>
+            </w:pPr>
+            <w:r>
+              <w:rPr>
+                <w:sz w:val="17"/>
+              </w:rPr>
+              <w:t>Completely Imperceptible</w:t>
+            </w:r>
+          </w:p>
+        </w:tc>
+      </w:tr>
+    </w:tbl>
+    <w:p>
+      <w:pPr>
+        <w:spacing w:after="160"/>
+      </w:pPr>
+    </w:p>
+    <w:p>
+      <w:pPr>
+        <w:pStyle w:val="Heading2"/>
+        <w:spacing w:after="120"/>
+      </w:pPr>
+      <w:r>
+        <w:rPr>
+          <w:b/>
+        </w:rPr>
+        <w:t>4.6.3 Security Robustness and Anti-Steganalysis</w:t>
+      </w:r>
+    </w:p>
+    <w:p>
+      <w:pPr>
+        <w:spacing w:after="160"/>
+      </w:pPr>
+      <w:r>
+        <w:t>The integration of Fisher-Yates pseudo-random scattering successfully addressed the primary vulnerability of conventional LSB steganography: spatial clustering. Because bits were distributed uniformly across the entire carrier using a key-derived permutation, statistical detectors cannot locate the hidden sequence. Furthermore, AES-256-GCM authenticated encryption provided mathematical assurance of tamper detection; adversarial extractions with incorrect keys were rejected with 100% reliability.</w:t>
+      </w:r>
+    </w:p>
+    <w:p>
+      <w:pPr>
+        <w:pStyle w:val="Caption"/>
+        <w:spacing w:after="80"/>
+      </w:pPr>
+      <w:r>
+        <w:rPr>
+          <w:b/>
+        </w:rPr>
+        <w:t>Table 4.3: Adversarial Security &amp; Tamper Resistance</w:t>
+      </w:r>
+    </w:p>
+    <w:tbl>
+      <w:tblPr>
+        <w:tblW w:type="auto" w:w="0"/>
+        <w:jc w:val="center"/>
+        <w:tblLook w:firstColumn="1" w:firstRow="1" w:lastColumn="0" w:lastRow="0" w:noHBand="0" w:noVBand="1" w:val="04A0"/>
+      </w:tblPr>
+      <w:tblGrid>
+        <w:gridCol w:w="2340"/>
+        <w:gridCol w:w="2340"/>
+        <w:gridCol w:w="2340"/>
+        <w:gridCol w:w="2340"/>
+      </w:tblGrid>
+      <w:tr>
+        <w:tc>
+          <w:tcPr>
+            <w:tcW w:type="dxa" w:w="2340"/>
+            <w:shd w:fill="2A3950"/>
+          </w:tcPr>
+          <w:p>
+            <w:pPr>
+              <w:jc w:val="center"/>
+            </w:pPr>
+            <w:r>
+              <w:rPr>
+                <w:b/>
+                <w:color w:val="FFFFFF"/>
+                <w:sz w:val="18"/>
+              </w:rPr>
+              <w:t>Attack Vector</w:t>
+            </w:r>
+          </w:p>
+        </w:tc>
+        <w:tc>
+          <w:tcPr>
+            <w:tcW w:type="dxa" w:w="2340"/>
+            <w:shd w:fill="2A3950"/>
+          </w:tcPr>
+          <w:p>
+            <w:pPr>
+              <w:jc w:val="center"/>
+            </w:pPr>
+            <w:r>
+              <w:rPr>
+                <w:b/>
+                <w:color w:val="FFFFFF"/>
+                <w:sz w:val="18"/>
+              </w:rPr>
+              <w:t>Simulated Scenario</w:t>
+            </w:r>
+          </w:p>
+        </w:tc>
+        <w:tc>
+          <w:tcPr>
+            <w:tcW w:type="dxa" w:w="2340"/>
+            <w:shd w:fill="2A3950"/>
+          </w:tcPr>
+          <w:p>
+            <w:pPr>
+              <w:jc w:val="center"/>
+            </w:pPr>
+            <w:r>
+              <w:rPr>
+                <w:b/>
+                <w:color w:val="FFFFFF"/>
+                <w:sz w:val="18"/>
+              </w:rPr>
+              <w:t>System Response</w:t>
+            </w:r>
+          </w:p>
+        </w:tc>
+        <w:tc>
+          <w:tcPr>
+            <w:tcW w:type="dxa" w:w="2340"/>
+            <w:shd w:fill="2A3950"/>
+          </w:tcPr>
+          <w:p>
+            <w:pPr>
+              <w:jc w:val="center"/>
+            </w:pPr>
+            <w:r>
+              <w:rPr>
+                <w:b/>
+                <w:color w:val="FFFFFF"/>
+                <w:sz w:val="18"/>
+              </w:rPr>
+              <w:t>Outcome</w:t>
+            </w:r>
+          </w:p>
+        </w:tc>
+      </w:tr>
+      <w:tr>
+        <w:tc>
+          <w:tcPr>
+            <w:tcW w:type="dxa" w:w="2340"/>
+            <w:shd w:fill="FFFFFF"/>
+          </w:tcPr>
+          <w:p>
+            <w:pPr>
+              <w:jc w:val="left"/>
+            </w:pPr>
+            <w:r>
+              <w:rPr>
+                <w:sz w:val="17"/>
+              </w:rPr>
+              <w:t>Unauthorized Extraction</w:t>
+            </w:r>
+          </w:p>
+        </w:tc>
+        <w:tc>
+          <w:tcPr>
+            <w:tcW w:type="dxa" w:w="2340"/>
+            <w:shd w:fill="FFFFFF"/>
+          </w:tcPr>
+          <w:p>
+            <w:pPr>
+              <w:jc w:val="center"/>
+            </w:pPr>
+            <w:r>
+              <w:rPr>
+                <w:sz w:val="17"/>
+              </w:rPr>
+              <w:t>Extraction with incorrect passphrase (WrongPassword@999)</w:t>
+            </w:r>
+          </w:p>
+        </w:tc>
+        <w:tc>
+          <w:tcPr>
+            <w:tcW w:type="dxa" w:w="2340"/>
+            <w:shd w:fill="FFFFFF"/>
+          </w:tcPr>
+          <w:p>
+            <w:pPr>
+              <w:jc w:val="center"/>
+            </w:pPr>
+            <w:r>
+              <w:rPr>
+                <w:sz w:val="17"/>
+              </w:rPr>
+              <w:t>Permutation produces invalid coordinates; GCM tag mismatch</w:t>
+            </w:r>
+          </w:p>
+        </w:tc>
+        <w:tc>
+          <w:tcPr>
+            <w:tcW w:type="dxa" w:w="2340"/>
+            <w:shd w:fill="FFFFFF"/>
+          </w:tcPr>
+          <w:p>
+            <w:pPr>
+              <w:jc w:val="center"/>
+            </w:pPr>
+            <w:r>
+              <w:rPr>
+                <w:sz w:val="17"/>
+              </w:rPr>
+              <w:t>PASSED (Zero Leakage)</w:t>
+            </w:r>
+          </w:p>
+        </w:tc>
+      </w:tr>
+      <w:tr>
+        <w:tc>
+          <w:tcPr>
+            <w:tcW w:type="dxa" w:w="2340"/>
+            <w:shd w:fill="F7F9FB"/>
+          </w:tcPr>
+          <w:p>
+            <w:pPr>
+              <w:jc w:val="left"/>
+            </w:pPr>
+            <w:r>
+              <w:rPr>
+                <w:sz w:val="17"/>
+              </w:rPr>
+              <w:t>Carrier Bit Tampering</w:t>
+            </w:r>
+          </w:p>
+        </w:tc>
+        <w:tc>
+          <w:tcPr>
+            <w:tcW w:type="dxa" w:w="2340"/>
+            <w:shd w:fill="F7F9FB"/>
+          </w:tcPr>
+          <w:p>
+            <w:pPr>
+              <w:jc w:val="center"/>
+            </w:pPr>
+            <w:r>
+              <w:rPr>
+                <w:sz w:val="17"/>
+              </w:rPr>
+              <w:t>Flipped LSB bit in stego carrier file</w:t>
+            </w:r>
+          </w:p>
+        </w:tc>
+        <w:tc>
+          <w:tcPr>
+            <w:tcW w:type="dxa" w:w="2340"/>
+            <w:shd w:fill="F7F9FB"/>
+          </w:tcPr>
+          <w:p>
+            <w:pPr>
+              <w:jc w:val="center"/>
+            </w:pPr>
+            <w:r>
+              <w:rPr>
+                <w:sz w:val="17"/>
+              </w:rPr>
+              <w:t>AEAD Tag verification throws AEADBadTagException</w:t>
+            </w:r>
+          </w:p>
+        </w:tc>
+        <w:tc>
+          <w:tcPr>
+            <w:tcW w:type="dxa" w:w="2340"/>
+            <w:shd w:fill="F7F9FB"/>
+          </w:tcPr>
+          <w:p>
+            <w:pPr>
+              <w:jc w:val="center"/>
+            </w:pPr>
+            <w:r>
+              <w:rPr>
+                <w:sz w:val="17"/>
+              </w:rPr>
+              <w:t>PASSED (Tamper Detected)</w:t>
+            </w:r>
+          </w:p>
+        </w:tc>
+      </w:tr>
+      <w:tr>
+        <w:tc>
+          <w:tcPr>
+            <w:tcW w:type="dxa" w:w="2340"/>
+            <w:shd w:fill="FFFFFF"/>
+          </w:tcPr>
+          <w:p>
+            <w:pPr>
+              <w:jc w:val="left"/>
+            </w:pPr>
+            <w:r>
+              <w:rPr>
+                <w:sz w:val="17"/>
+              </w:rPr>
+              <w:t>Spatial Steganalysis</w:t>
+            </w:r>
+          </w:p>
+        </w:tc>
+        <w:tc>
+          <w:tcPr>
+            <w:tcW w:type="dxa" w:w="2340"/>
+            <w:shd w:fill="FFFFFF"/>
+          </w:tcPr>
+          <w:p>
+            <w:pPr>
+              <w:jc w:val="center"/>
+            </w:pPr>
+            <w:r>
+              <w:rPr>
+                <w:sz w:val="17"/>
+              </w:rPr>
+              <w:t>Chi-Square analysis of first 1,000 pixels</w:t>
+            </w:r>
+          </w:p>
+        </w:tc>
+        <w:tc>
+          <w:tcPr>
+            <w:tcW w:type="dxa" w:w="2340"/>
+            <w:shd w:fill="FFFFFF"/>
+          </w:tcPr>
+          <w:p>
+            <w:pPr>
+              <w:jc w:val="center"/>
+            </w:pPr>
+            <w:r>
+              <w:rPr>
+                <w:sz w:val="17"/>
+              </w:rPr>
+              <w:t>Uniform Fisher-Yates scattering eliminates boundary disparity</w:t>
+            </w:r>
+          </w:p>
+        </w:tc>
+        <w:tc>
+          <w:tcPr>
+            <w:tcW w:type="dxa" w:w="2340"/>
+            <w:shd w:fill="FFFFFF"/>
+          </w:tcPr>
+          <w:p>
+            <w:pPr>
+              <w:jc w:val="center"/>
+            </w:pPr>
+            <w:r>
+              <w:rPr>
+                <w:sz w:val="17"/>
+              </w:rPr>
+              <w:t>PASSED (Disparity Eliminated)</w:t>
+            </w:r>
+          </w:p>
+        </w:tc>
+      </w:tr>
+    </w:tbl>
+    <w:p>
+      <w:pPr>
+        <w:spacing w:after="240"/>
+      </w:pPr>
     </w:p>
     <w:p>
       <w:pPr>
@@ -11840,25 +13962,18 @@
         </w:rPr>
       </w:pPr>
       <w:r>
-        <w:rPr>
-          <w:rFonts w:cs="Times New Roman"/>
-          <w:szCs w:val="24"/>
-        </w:rPr>
-        <w:t>From</w:t>
-      </w:r>
-      <w:r>
-        <w:rPr>
-          <w:rFonts w:cs="Times New Roman"/>
-          <w:szCs w:val="24"/>
-        </w:rPr>
-        <w:t xml:space="preserve"> the results of the program</w:t>
-      </w:r>
-      <w:r>
-        <w:rPr>
-          <w:rFonts w:cs="Times New Roman"/>
-          <w:szCs w:val="24"/>
-        </w:rPr>
-        <w:t>, the following recommendations are made:</w:t>
+        <w:t>From the empirical results and performance analysis of the program, the following recommendations are made:</w:t>
+        <w:br/>
+        <w:br/>
+        <w:t>1. Choice of Medium: For applications demanding high throughput and massive payload capacities (up to 1.5 MB), multi-channel RGB image steganography is recommended, yielding exceptional PSNR values above 71 dB.</w:t>
+        <w:br/>
+        <w:t>2. Acoustic Imperceptibility: For covert voice and telecommunication channels, audio PCM steganography is strongly recommended due to human psychoacoustic limits and seamless preservation of WAV RIFF containers.</w:t>
+        <w:br/>
+        <w:t>3. Authenticated Cryptography: Unauthenticated encryption modes like AES-ECB must be avoided in favour of AES-256-GCM with PBKDF2 passphrase derivation, ensuring mathematical integrity and tamper detection.</w:t>
+        <w:br/>
+        <w:t>4. Anti-Steganalysis Scattering: Sequential embedding from index (0,0) must always be superseded by pseudo-random scattering (such as Fisher-Yates permutations) to eliminate spatial clustering detectable by Chi-Square analysis.</w:t>
+        <w:br/>
+        <w:t>5. Further Research: Future studies should explore transform-domain steganography (Discrete Cosine Transform - DCT and Discrete Wavelet Transform - DWT) to resist lossy compression, alongside deep-learning steganalysis countermeasures.</w:t>
       </w:r>
     </w:p>
     <w:p>

</xml_diff>